<commit_message>
Update README with GitHub repos table
</commit_message>
<xml_diff>
--- a/GBA_GS2026_1_Relatorio_Integracao.docx
+++ b/GBA_GS2026_1_Relatorio_Integracao.docx
@@ -75,7 +75,15 @@
           <w:sz w:val="22"/>
           <w:szCs w:val="22"/>
         </w:rPr>
-        <w:t xml:space="preserve">2TIAP </w:t>
+        <w:t>2TIAPY</w:t>
+      </w:r>
+      <w:r>
+        <w:rPr>
+          <w:color w:val="000000"/>
+          <w:sz w:val="22"/>
+          <w:szCs w:val="22"/>
+        </w:rPr>
+        <w:t xml:space="preserve"> </w:t>
       </w:r>
       <w:r>
         <w:rPr>
@@ -237,7 +245,17 @@
           <w:sz w:val="36"/>
           <w:szCs w:val="36"/>
         </w:rPr>
-        <w:t>GLOBAL SOLUTION 2026.1</w:t>
+        <w:t xml:space="preserve">GLOBAL SOLUTION </w:t>
+      </w:r>
+      <w:r>
+        <w:rPr>
+          <w:b/>
+          <w:bCs/>
+          <w:color w:val="1F3864"/>
+          <w:sz w:val="36"/>
+          <w:szCs w:val="36"/>
+        </w:rPr>
+        <w:t>2026.1</w:t>
       </w:r>
     </w:p>
     <w:p>
@@ -525,7 +543,13 @@
         <w:rPr>
           <w:color w:val="000000"/>
         </w:rPr>
-        <w:t>aplicadas ao Monitoramento Espacial e Sustentabilidade Ambiental</w:t>
+        <w:t xml:space="preserve">aplicadas ao Monitoramento Espacial e </w:t>
+      </w:r>
+      <w:r>
+        <w:rPr>
+          <w:color w:val="000000"/>
+        </w:rPr>
+        <w:t>Sustentabilidade Ambiental</w:t>
       </w:r>
     </w:p>
     <w:p>
@@ -955,21 +979,12 @@
           <w:lang w:val="en-US"/>
         </w:rPr>
       </w:pPr>
-      <w:proofErr w:type="gramStart"/>
       <w:r>
         <w:rPr>
           <w:color w:val="000000"/>
           <w:lang w:val="en-US"/>
         </w:rPr>
-        <w:t>4  COMPUTAÇÃO</w:t>
-      </w:r>
-      <w:proofErr w:type="gramEnd"/>
-      <w:r>
-        <w:rPr>
-          <w:color w:val="000000"/>
-          <w:lang w:val="en-US"/>
-        </w:rPr>
-        <w:t xml:space="preserve"> QUÂNTICA &amp; IA ................................................ 9</w:t>
+        <w:t>4  COMPUTAÇÃO QUÂNTICA &amp; IA ................................................ 9</w:t>
       </w:r>
     </w:p>
     <w:p>
@@ -980,47 +995,33 @@
           <w:lang w:val="en-US"/>
         </w:rPr>
       </w:pPr>
-      <w:proofErr w:type="gramStart"/>
       <w:r>
         <w:rPr>
           <w:color w:val="000000"/>
           <w:lang w:val="en-US"/>
         </w:rPr>
-        <w:t>5  FRONT</w:t>
-      </w:r>
-      <w:proofErr w:type="gramEnd"/>
-      <w:r>
-        <w:rPr>
-          <w:color w:val="000000"/>
-          <w:lang w:val="en-US"/>
-        </w:rPr>
-        <w:t xml:space="preserve"> END &amp; MOBILE DEVELOPMENT ......................................... 10</w:t>
+        <w:t>5  FRONT END &amp; MOBILE DEVELOPMENT ......................................... 10</w:t>
       </w:r>
     </w:p>
     <w:p>
       <w:pPr>
         <w:spacing w:after="200" w:line="360" w:lineRule="auto"/>
         <w:jc w:val="both"/>
-      </w:pPr>
-      <w:proofErr w:type="gramStart"/>
-      <w:r>
-        <w:rPr>
-          <w:color w:val="000000"/>
+        <w:rPr>
           <w:lang w:val="en-US"/>
         </w:rPr>
-        <w:t>6  GENERATIVE</w:t>
-      </w:r>
-      <w:proofErr w:type="gramEnd"/>
+      </w:pPr>
       <w:r>
         <w:rPr>
           <w:color w:val="000000"/>
           <w:lang w:val="en-US"/>
         </w:rPr>
-        <w:t xml:space="preserve"> AI &amp; ADVANCED NETS .......................................... </w:t>
-      </w:r>
-      <w:r>
-        <w:rPr>
-          <w:color w:val="000000"/>
+        <w:t xml:space="preserve">6  GENERATIVE AI &amp; ADVANCED NETS .......................................... </w:t>
+      </w:r>
+      <w:r>
+        <w:rPr>
+          <w:color w:val="000000"/>
+          <w:lang w:val="en-US"/>
         </w:rPr>
         <w:t>11</w:t>
       </w:r>
@@ -1033,7 +1034,6 @@
           <w:lang w:val="en-US"/>
         </w:rPr>
       </w:pPr>
-      <w:proofErr w:type="gramStart"/>
       <w:r>
         <w:rPr>
           <w:color w:val="000000"/>
@@ -1041,7 +1041,6 @@
         </w:rPr>
         <w:t>7  PHYSICAL</w:t>
       </w:r>
-      <w:proofErr w:type="gramEnd"/>
       <w:r>
         <w:rPr>
           <w:color w:val="000000"/>
@@ -1145,7 +1144,13 @@
         <w:rPr>
           <w:color w:val="000000"/>
         </w:rPr>
-        <w:t>A Global Solution 2026.1 propõe que os estudantes demonstrem, de forma integrada, a aplicação dos conteúdos desenvolvidos ao longo do semestre em cada uma das nove disciplinas da grade curricular do curso de Tecnologia em Inteligência Artificial da FIAP. Este documento sintetiza o trabalho produzido pelo grupo, formado por Arthur Baptista dos Santos (RM 565346), João Pedro de Moura Dutra Franco (RM 561738) e Nelson Félix Neto (RM 565603).</w:t>
+        <w:t xml:space="preserve">A Global Solution 2026.1 propõe que os estudantes demonstrem, de forma integrada, a aplicação dos conteúdos desenvolvidos ao longo do semestre em cada uma das nove disciplinas da grade curricular do </w:t>
+      </w:r>
+      <w:r>
+        <w:rPr>
+          <w:color w:val="000000"/>
+        </w:rPr>
+        <w:t>curso de Tecnologia em Inteligência Artificial da FIAP. Este documento sintetiza o trabalho produzido pelo grupo, formado por Arthur Baptista dos Santos (RM 565346), João Pedro de Moura Dutra Franco (RM 561738) e Nelson Félix Neto (RM 565603).</w:t>
       </w:r>
     </w:p>
     <w:p>
@@ -1157,7 +1162,13 @@
         <w:rPr>
           <w:color w:val="000000"/>
         </w:rPr>
-        <w:t>O fio condutor escolhido pelo grupo foi o monitoramento espacial e a sustentabilidade ambiental. Cada projeto desenvolvido ao longo do semestre foi contextualizado neste eixo temático, o que possibilitou uma coerência narrativa entre disciplinas tão distintas quanto IoT, Visão Computacional, Computação Quântica e Processamento de Linguagem Natural. A escolha do tema não foi arbitrária: o monitoramento por satélites e sensores remotos é hoje um dos campos de maior crescimento na interseção entre Inteligência Artificial e infraestrutura crítica, alinhando-se diretamente ao Objetivo de Desenvolvimento Sustentável 9 da ONU (Indústria, Inovação e Infraestrutura).</w:t>
+        <w:t>O fio condutor escolhido pelo grupo foi o monitoramento espacial e a sustentabilidade ambiental. Cada projeto desenvolvido ao longo do semestre foi contextualizado neste eixo temático, o que possibilitou uma coerência narrativa entre disciplinas tão distintas quanto IoT, Visão Computacional, Computação Quântica e Processamento de Linguagem Natural. A escolha do tema não foi arbitrária: o monitoramento por satélites e sensores remotos é hoje um dos campos de maior crescimento na interseção entre Inteligência</w:t>
+      </w:r>
+      <w:r>
+        <w:rPr>
+          <w:color w:val="000000"/>
+        </w:rPr>
+        <w:t xml:space="preserve"> Artificial e infraestrutura crítica, alinhando-se diretamente ao Objetivo de Desenvolvimento Sustentável 9 da ONU (Indústria, Inovação e Infraestrutura).</w:t>
       </w:r>
     </w:p>
     <w:p>
@@ -1241,12 +1252,6 @@
         <w:gridCol w:w="2431"/>
       </w:tblGrid>
       <w:tr>
-        <w:tblPrEx>
-          <w:tblCellMar>
-            <w:top w:w="0" w:type="dxa"/>
-            <w:bottom w:w="0" w:type="dxa"/>
-          </w:tblCellMar>
-        </w:tblPrEx>
         <w:tc>
           <w:tcPr>
             <w:tcW w:w="2267" w:type="dxa"/>
@@ -1381,12 +1386,6 @@
         </w:tc>
       </w:tr>
       <w:tr>
-        <w:tblPrEx>
-          <w:tblCellMar>
-            <w:top w:w="0" w:type="dxa"/>
-            <w:bottom w:w="0" w:type="dxa"/>
-          </w:tblCellMar>
-        </w:tblPrEx>
         <w:tc>
           <w:tcPr>
             <w:tcW w:w="2267" w:type="dxa"/>
@@ -1489,12 +1488,6 @@
         </w:tc>
       </w:tr>
       <w:tr>
-        <w:tblPrEx>
-          <w:tblCellMar>
-            <w:top w:w="0" w:type="dxa"/>
-            <w:bottom w:w="0" w:type="dxa"/>
-          </w:tblCellMar>
-        </w:tblPrEx>
         <w:tc>
           <w:tcPr>
             <w:tcW w:w="2267" w:type="dxa"/>
@@ -1612,12 +1605,6 @@
         </w:tc>
       </w:tr>
       <w:tr>
-        <w:tblPrEx>
-          <w:tblCellMar>
-            <w:top w:w="0" w:type="dxa"/>
-            <w:bottom w:w="0" w:type="dxa"/>
-          </w:tblCellMar>
-        </w:tblPrEx>
         <w:tc>
           <w:tcPr>
             <w:tcW w:w="2267" w:type="dxa"/>
@@ -1738,12 +1725,6 @@
         </w:tc>
       </w:tr>
       <w:tr>
-        <w:tblPrEx>
-          <w:tblCellMar>
-            <w:top w:w="0" w:type="dxa"/>
-            <w:bottom w:w="0" w:type="dxa"/>
-          </w:tblCellMar>
-        </w:tblPrEx>
         <w:tc>
           <w:tcPr>
             <w:tcW w:w="2267" w:type="dxa"/>
@@ -1860,12 +1841,6 @@
         </w:tc>
       </w:tr>
       <w:tr>
-        <w:tblPrEx>
-          <w:tblCellMar>
-            <w:top w:w="0" w:type="dxa"/>
-            <w:bottom w:w="0" w:type="dxa"/>
-          </w:tblCellMar>
-        </w:tblPrEx>
         <w:tc>
           <w:tcPr>
             <w:tcW w:w="2267" w:type="dxa"/>
@@ -1986,12 +1961,6 @@
         </w:tc>
       </w:tr>
       <w:tr>
-        <w:tblPrEx>
-          <w:tblCellMar>
-            <w:top w:w="0" w:type="dxa"/>
-            <w:bottom w:w="0" w:type="dxa"/>
-          </w:tblCellMar>
-        </w:tblPrEx>
         <w:tc>
           <w:tcPr>
             <w:tcW w:w="2267" w:type="dxa"/>
@@ -2094,12 +2063,6 @@
         </w:tc>
       </w:tr>
       <w:tr>
-        <w:tblPrEx>
-          <w:tblCellMar>
-            <w:top w:w="0" w:type="dxa"/>
-            <w:bottom w:w="0" w:type="dxa"/>
-          </w:tblCellMar>
-        </w:tblPrEx>
         <w:tc>
           <w:tcPr>
             <w:tcW w:w="2267" w:type="dxa"/>
@@ -2206,12 +2169,6 @@
         </w:tc>
       </w:tr>
       <w:tr>
-        <w:tblPrEx>
-          <w:tblCellMar>
-            <w:top w:w="0" w:type="dxa"/>
-            <w:bottom w:w="0" w:type="dxa"/>
-          </w:tblCellMar>
-        </w:tblPrEx>
         <w:tc>
           <w:tcPr>
             <w:tcW w:w="2267" w:type="dxa"/>
@@ -2374,7 +2331,13 @@
         <w:rPr>
           <w:color w:val="000000"/>
         </w:rPr>
-        <w:t>A análise manual de logs de missões espaciais é um processo custoso e sujeito a erros humanos. Missões de longa duração geram centenas de arquivos de texto contendo eventos críticos, alertas e registros de status que precisam ser classificados, sumarizados e reportados com agilidade.</w:t>
+        <w:t xml:space="preserve">A análise manual de logs de </w:t>
+      </w:r>
+      <w:r>
+        <w:rPr>
+          <w:color w:val="000000"/>
+        </w:rPr>
+        <w:t>missões espaciais é um processo custoso e sujeito a erros humanos. Missões de longa duração geram centenas de arquivos de texto contendo eventos críticos, alertas e registros de status que precisam ser classificados, sumarizados e reportados com agilidade.</w:t>
       </w:r>
     </w:p>
     <w:p>
@@ -2477,12 +2440,6 @@
         <w:gridCol w:w="3024"/>
       </w:tblGrid>
       <w:tr>
-        <w:tblPrEx>
-          <w:tblCellMar>
-            <w:top w:w="0" w:type="dxa"/>
-            <w:bottom w:w="0" w:type="dxa"/>
-          </w:tblCellMar>
-        </w:tblPrEx>
         <w:tc>
           <w:tcPr>
             <w:tcW w:w="3023" w:type="dxa"/>
@@ -2584,12 +2541,6 @@
         </w:tc>
       </w:tr>
       <w:tr>
-        <w:tblPrEx>
-          <w:tblCellMar>
-            <w:top w:w="0" w:type="dxa"/>
-            <w:bottom w:w="0" w:type="dxa"/>
-          </w:tblCellMar>
-        </w:tblPrEx>
         <w:tc>
           <w:tcPr>
             <w:tcW w:w="3023" w:type="dxa"/>
@@ -2670,12 +2621,6 @@
         </w:tc>
       </w:tr>
       <w:tr>
-        <w:tblPrEx>
-          <w:tblCellMar>
-            <w:top w:w="0" w:type="dxa"/>
-            <w:bottom w:w="0" w:type="dxa"/>
-          </w:tblCellMar>
-        </w:tblPrEx>
         <w:tc>
           <w:tcPr>
             <w:tcW w:w="3023" w:type="dxa"/>
@@ -2756,12 +2701,6 @@
         </w:tc>
       </w:tr>
       <w:tr>
-        <w:tblPrEx>
-          <w:tblCellMar>
-            <w:top w:w="0" w:type="dxa"/>
-            <w:bottom w:w="0" w:type="dxa"/>
-          </w:tblCellMar>
-        </w:tblPrEx>
         <w:tc>
           <w:tcPr>
             <w:tcW w:w="3023" w:type="dxa"/>
@@ -2810,7 +2749,14 @@
                 <w:sz w:val="20"/>
                 <w:szCs w:val="20"/>
               </w:rPr>
-              <w:t>Tokenização + threshold + análise de pixels</w:t>
+              <w:t xml:space="preserve">Tokenização + threshold + análise de </w:t>
+            </w:r>
+            <w:r>
+              <w:rPr>
+                <w:sz w:val="20"/>
+                <w:szCs w:val="20"/>
+              </w:rPr>
+              <w:t>pixels</w:t>
             </w:r>
           </w:p>
         </w:tc>
@@ -2842,12 +2788,6 @@
         </w:tc>
       </w:tr>
       <w:tr>
-        <w:tblPrEx>
-          <w:tblCellMar>
-            <w:top w:w="0" w:type="dxa"/>
-            <w:bottom w:w="0" w:type="dxa"/>
-          </w:tblCellMar>
-        </w:tblPrEx>
         <w:tc>
           <w:tcPr>
             <w:tcW w:w="3023" w:type="dxa"/>
@@ -3076,12 +3016,6 @@
         <w:gridCol w:w="4536"/>
       </w:tblGrid>
       <w:tr>
-        <w:tblPrEx>
-          <w:tblCellMar>
-            <w:top w:w="0" w:type="dxa"/>
-            <w:bottom w:w="0" w:type="dxa"/>
-          </w:tblCellMar>
-        </w:tblPrEx>
         <w:tc>
           <w:tcPr>
             <w:tcW w:w="4535" w:type="dxa"/>
@@ -3170,12 +3104,6 @@
         </w:tc>
       </w:tr>
       <w:tr>
-        <w:tblPrEx>
-          <w:tblCellMar>
-            <w:top w:w="0" w:type="dxa"/>
-            <w:bottom w:w="0" w:type="dxa"/>
-          </w:tblCellMar>
-        </w:tblPrEx>
         <w:tc>
           <w:tcPr>
             <w:tcW w:w="4535" w:type="dxa"/>
@@ -3230,12 +3158,6 @@
         </w:tc>
       </w:tr>
       <w:tr>
-        <w:tblPrEx>
-          <w:tblCellMar>
-            <w:top w:w="0" w:type="dxa"/>
-            <w:bottom w:w="0" w:type="dxa"/>
-          </w:tblCellMar>
-        </w:tblPrEx>
         <w:tc>
           <w:tcPr>
             <w:tcW w:w="4535" w:type="dxa"/>
@@ -3290,12 +3212,6 @@
         </w:tc>
       </w:tr>
       <w:tr>
-        <w:tblPrEx>
-          <w:tblCellMar>
-            <w:top w:w="0" w:type="dxa"/>
-            <w:bottom w:w="0" w:type="dxa"/>
-          </w:tblCellMar>
-        </w:tblPrEx>
         <w:tc>
           <w:tcPr>
             <w:tcW w:w="4535" w:type="dxa"/>
@@ -3350,12 +3266,6 @@
         </w:tc>
       </w:tr>
       <w:tr>
-        <w:tblPrEx>
-          <w:tblCellMar>
-            <w:top w:w="0" w:type="dxa"/>
-            <w:bottom w:w="0" w:type="dxa"/>
-          </w:tblCellMar>
-        </w:tblPrEx>
         <w:tc>
           <w:tcPr>
             <w:tcW w:w="4535" w:type="dxa"/>
@@ -3411,12 +3321,6 @@
         </w:tc>
       </w:tr>
       <w:tr>
-        <w:tblPrEx>
-          <w:tblCellMar>
-            <w:top w:w="0" w:type="dxa"/>
-            <w:bottom w:w="0" w:type="dxa"/>
-          </w:tblCellMar>
-        </w:tblPrEx>
         <w:tc>
           <w:tcPr>
             <w:tcW w:w="4535" w:type="dxa"/>
@@ -3471,12 +3375,6 @@
         </w:tc>
       </w:tr>
       <w:tr>
-        <w:tblPrEx>
-          <w:tblCellMar>
-            <w:top w:w="0" w:type="dxa"/>
-            <w:bottom w:w="0" w:type="dxa"/>
-          </w:tblCellMar>
-        </w:tblPrEx>
         <w:tc>
           <w:tcPr>
             <w:tcW w:w="4535" w:type="dxa"/>
@@ -3577,7 +3475,13 @@
         <w:rPr>
           <w:color w:val="000000"/>
         </w:rPr>
-        <w:t>Satélites em órbita baixa (LEO) geram fluxos contínuos de dados de telemetria provenientes de múltiplos sensores (temperatura, pressão, tensão, corrente, etc.). Anomalias nesses sinais podem indicar falhas de hardware iminentes. A detecção precoce é crítica para missões de longa duração, onde intervenção manual é impossível.</w:t>
+        <w:t xml:space="preserve">Satélites em órbita baixa (LEO) geram fluxos contínuos de dados de telemetria provenientes de múltiplos sensores (temperatura, pressão, tensão, corrente, </w:t>
+      </w:r>
+      <w:r>
+        <w:rPr>
+          <w:color w:val="000000"/>
+        </w:rPr>
+        <w:t>etc.). Anomalias nesses sinais podem indicar falhas de hardware iminentes. A detecção precoce é crítica para missões de longa duração, onde intervenção manual é impossível.</w:t>
       </w:r>
     </w:p>
     <w:p>
@@ -3681,12 +3585,6 @@
         <w:gridCol w:w="2268"/>
       </w:tblGrid>
       <w:tr>
-        <w:tblPrEx>
-          <w:tblCellMar>
-            <w:top w:w="0" w:type="dxa"/>
-            <w:bottom w:w="0" w:type="dxa"/>
-          </w:tblCellMar>
-        </w:tblPrEx>
         <w:tc>
           <w:tcPr>
             <w:tcW w:w="2267" w:type="dxa"/>
@@ -3821,12 +3719,6 @@
         </w:tc>
       </w:tr>
       <w:tr>
-        <w:tblPrEx>
-          <w:tblCellMar>
-            <w:top w:w="0" w:type="dxa"/>
-            <w:bottom w:w="0" w:type="dxa"/>
-          </w:tblCellMar>
-        </w:tblPrEx>
         <w:tc>
           <w:tcPr>
             <w:tcW w:w="2267" w:type="dxa"/>
@@ -3933,12 +3825,6 @@
         </w:tc>
       </w:tr>
       <w:tr>
-        <w:tblPrEx>
-          <w:tblCellMar>
-            <w:top w:w="0" w:type="dxa"/>
-            <w:bottom w:w="0" w:type="dxa"/>
-          </w:tblCellMar>
-        </w:tblPrEx>
         <w:tc>
           <w:tcPr>
             <w:tcW w:w="2267" w:type="dxa"/>
@@ -4045,12 +3931,6 @@
         </w:tc>
       </w:tr>
       <w:tr>
-        <w:tblPrEx>
-          <w:tblCellMar>
-            <w:top w:w="0" w:type="dxa"/>
-            <w:bottom w:w="0" w:type="dxa"/>
-          </w:tblCellMar>
-        </w:tblPrEx>
         <w:tc>
           <w:tcPr>
             <w:tcW w:w="2267" w:type="dxa"/>
@@ -4178,7 +4058,10 @@
       </w:pPr>
       <w:r>
         <w:lastRenderedPageBreak/>
-        <w:t>4.3  Link do Vídeo Demonstrativo</w:t>
+        <w:t xml:space="preserve">4.3  Link do </w:t>
+      </w:r>
+      <w:r>
+        <w:t>Vídeo Demonstrativo</w:t>
       </w:r>
     </w:p>
     <w:p>
@@ -4188,27 +4071,14 @@
       <w:r>
         <w:t xml:space="preserve">Disponível em: </w:t>
       </w:r>
-      <w:r>
-        <w:fldChar w:fldCharType="begin"/>
-      </w:r>
-      <w:r>
-        <w:instrText>HYPERLINK "https://youtu.be/v78XVNwJDBg"</w:instrText>
-      </w:r>
-      <w:r>
-        <w:fldChar w:fldCharType="separate"/>
-      </w:r>
-      <w:r>
-        <w:rPr>
-          <w:rStyle w:val="Hyperlink"/>
-        </w:rPr>
-        <w:t>https://youtu.be/v78XVNwJDBg</w:t>
-      </w:r>
-      <w:r>
-        <w:rPr>
-          <w:rStyle w:val="Hyperlink"/>
-        </w:rPr>
-        <w:fldChar w:fldCharType="end"/>
-      </w:r>
+      <w:hyperlink r:id="rId7" w:history="1">
+        <w:r>
+          <w:rPr>
+            <w:rStyle w:val="Hyperlink"/>
+          </w:rPr>
+          <w:t>https://youtu.be/v78XVNwJDBg</w:t>
+        </w:r>
+      </w:hyperlink>
     </w:p>
     <w:p>
       <w:r>
@@ -4222,59 +4092,27 @@
           <w:lang w:val="en-US"/>
         </w:rPr>
       </w:pPr>
-      <w:proofErr w:type="gramStart"/>
       <w:r>
         <w:rPr>
           <w:lang w:val="en-US"/>
         </w:rPr>
         <w:lastRenderedPageBreak/>
-        <w:t>5  FRONT</w:t>
-      </w:r>
-      <w:proofErr w:type="gramEnd"/>
-      <w:r>
+        <w:t>5  FRONT END &amp; MOBILE DEVELOPMENT</w:t>
+      </w:r>
+    </w:p>
+    <w:p>
+      <w:pPr>
+        <w:pStyle w:val="Heading2"/>
         <w:rPr>
           <w:lang w:val="en-US"/>
         </w:rPr>
-        <w:t xml:space="preserve"> END &amp; MOBILE DEVELOPMENT</w:t>
-      </w:r>
-    </w:p>
-    <w:p>
-      <w:pPr>
-        <w:pStyle w:val="Heading2"/>
+      </w:pPr>
+      <w:r>
         <w:rPr>
           <w:lang w:val="en-US"/>
         </w:rPr>
-      </w:pPr>
-      <w:proofErr w:type="gramStart"/>
-      <w:r>
-        <w:rPr>
-          <w:lang w:val="en-US"/>
-        </w:rPr>
-        <w:t xml:space="preserve">5.1  </w:t>
-      </w:r>
-      <w:proofErr w:type="spellStart"/>
-      <w:r>
-        <w:rPr>
-          <w:lang w:val="en-US"/>
-        </w:rPr>
-        <w:t>Contexto</w:t>
-      </w:r>
-      <w:proofErr w:type="spellEnd"/>
-      <w:proofErr w:type="gramEnd"/>
-      <w:r>
-        <w:rPr>
-          <w:lang w:val="en-US"/>
-        </w:rPr>
-        <w:t xml:space="preserve"> e </w:t>
-      </w:r>
-      <w:proofErr w:type="spellStart"/>
-      <w:r>
-        <w:rPr>
-          <w:lang w:val="en-US"/>
-        </w:rPr>
-        <w:t>Problema</w:t>
-      </w:r>
-      <w:proofErr w:type="spellEnd"/>
+        <w:t>5.1  Contexto e Problema</w:t>
+      </w:r>
     </w:p>
     <w:p>
       <w:pPr>
@@ -4285,7 +4123,13 @@
         <w:rPr>
           <w:color w:val="000000"/>
         </w:rPr>
-        <w:t>Queimadas no Brasil causam impactos ambientais, econômicos e sociais devastadores. Tomadores de decisão precisam de informações em tempo real sobre focos ativos, nível de risco e área afetada para acionar protocolos de resposta adequados. A ausência de dashboards intuitivos que consolidem dados satelitais representa um gargalo operacional significativo.</w:t>
+        <w:t xml:space="preserve">Queimadas no Brasil causam impactos ambientais, econômicos e sociais devastadores. Tomadores de decisão precisam de informações em tempo real sobre focos </w:t>
+      </w:r>
+      <w:r>
+        <w:rPr>
+          <w:color w:val="000000"/>
+        </w:rPr>
+        <w:t>ativos, nível de risco e área afetada para acionar protocolos de resposta adequados. A ausência de dashboards intuitivos que consolidem dados satelitais representa um gargalo operacional significativo.</w:t>
       </w:r>
     </w:p>
     <w:p>
@@ -4375,12 +4219,6 @@
         <w:gridCol w:w="4536"/>
       </w:tblGrid>
       <w:tr>
-        <w:tblPrEx>
-          <w:tblCellMar>
-            <w:top w:w="0" w:type="dxa"/>
-            <w:bottom w:w="0" w:type="dxa"/>
-          </w:tblCellMar>
-        </w:tblPrEx>
         <w:tc>
           <w:tcPr>
             <w:tcW w:w="4535" w:type="dxa"/>
@@ -4449,12 +4287,6 @@
         </w:tc>
       </w:tr>
       <w:tr>
-        <w:tblPrEx>
-          <w:tblCellMar>
-            <w:top w:w="0" w:type="dxa"/>
-            <w:bottom w:w="0" w:type="dxa"/>
-          </w:tblCellMar>
-        </w:tblPrEx>
         <w:tc>
           <w:tcPr>
             <w:tcW w:w="4535" w:type="dxa"/>
@@ -4503,62 +4335,18 @@
                 <w:lang w:val="en-US"/>
               </w:rPr>
             </w:pPr>
-            <w:proofErr w:type="spellStart"/>
-            <w:proofErr w:type="gramStart"/>
             <w:r>
               <w:rPr>
                 <w:sz w:val="20"/>
                 <w:szCs w:val="20"/>
                 <w:lang w:val="en-US"/>
               </w:rPr>
-              <w:t>st.session</w:t>
-            </w:r>
-            <w:proofErr w:type="gramEnd"/>
-            <w:r>
-              <w:rPr>
-                <w:sz w:val="20"/>
-                <w:szCs w:val="20"/>
-                <w:lang w:val="en-US"/>
-              </w:rPr>
-              <w:t>_state</w:t>
-            </w:r>
-            <w:proofErr w:type="spellEnd"/>
-            <w:r>
-              <w:rPr>
-                <w:sz w:val="20"/>
-                <w:szCs w:val="20"/>
-                <w:lang w:val="en-US"/>
-              </w:rPr>
-              <w:t xml:space="preserve"> + @st.cache_data </w:t>
-            </w:r>
-            <w:proofErr w:type="spellStart"/>
-            <w:r>
-              <w:rPr>
-                <w:sz w:val="20"/>
-                <w:szCs w:val="20"/>
-                <w:lang w:val="en-US"/>
-              </w:rPr>
-              <w:t>em</w:t>
-            </w:r>
-            <w:proofErr w:type="spellEnd"/>
-            <w:r>
-              <w:rPr>
-                <w:sz w:val="20"/>
-                <w:szCs w:val="20"/>
-                <w:lang w:val="en-US"/>
-              </w:rPr>
-              <w:t xml:space="preserve"> providers/</w:t>
+              <w:t>st.session_state + @st.cache_data em providers/</w:t>
             </w:r>
           </w:p>
         </w:tc>
       </w:tr>
       <w:tr>
-        <w:tblPrEx>
-          <w:tblCellMar>
-            <w:top w:w="0" w:type="dxa"/>
-            <w:bottom w:w="0" w:type="dxa"/>
-          </w:tblCellMar>
-        </w:tblPrEx>
         <w:tc>
           <w:tcPr>
             <w:tcW w:w="4535" w:type="dxa"/>
@@ -4613,36 +4401,12 @@
                 <w:szCs w:val="20"/>
                 <w:lang w:val="en-US"/>
               </w:rPr>
-              <w:t xml:space="preserve">providers/, pipelines/, features/, state/, </w:t>
-            </w:r>
-            <w:proofErr w:type="spellStart"/>
-            <w:r>
-              <w:rPr>
-                <w:sz w:val="20"/>
-                <w:szCs w:val="20"/>
-                <w:lang w:val="en-US"/>
-              </w:rPr>
-              <w:t>ui</w:t>
-            </w:r>
-            <w:proofErr w:type="spellEnd"/>
-            <w:r>
-              <w:rPr>
-                <w:sz w:val="20"/>
-                <w:szCs w:val="20"/>
-                <w:lang w:val="en-US"/>
-              </w:rPr>
-              <w:t>/</w:t>
+              <w:t>providers/, pipelines/, features/, state/, ui/</w:t>
             </w:r>
           </w:p>
         </w:tc>
       </w:tr>
       <w:tr>
-        <w:tblPrEx>
-          <w:tblCellMar>
-            <w:top w:w="0" w:type="dxa"/>
-            <w:bottom w:w="0" w:type="dxa"/>
-          </w:tblCellMar>
-        </w:tblPrEx>
         <w:tc>
           <w:tcPr>
             <w:tcW w:w="4535" w:type="dxa"/>
@@ -4697,12 +4461,6 @@
         </w:tc>
       </w:tr>
       <w:tr>
-        <w:tblPrEx>
-          <w:tblCellMar>
-            <w:top w:w="0" w:type="dxa"/>
-            <w:bottom w:w="0" w:type="dxa"/>
-          </w:tblCellMar>
-        </w:tblPrEx>
         <w:tc>
           <w:tcPr>
             <w:tcW w:w="4535" w:type="dxa"/>
@@ -4725,7 +4483,14 @@
                 <w:sz w:val="20"/>
                 <w:szCs w:val="20"/>
               </w:rPr>
-              <w:t>Gráficos (Plotly obrigatório)</w:t>
+              <w:t xml:space="preserve">Gráficos </w:t>
+            </w:r>
+            <w:r>
+              <w:rPr>
+                <w:sz w:val="20"/>
+                <w:szCs w:val="20"/>
+              </w:rPr>
+              <w:t>(Plotly obrigatório)</w:t>
             </w:r>
           </w:p>
         </w:tc>
@@ -4757,36 +4522,12 @@
                 <w:szCs w:val="20"/>
                 <w:lang w:val="en-US"/>
               </w:rPr>
-              <w:t>Line, Bar, Donut, Scatter Map (</w:t>
-            </w:r>
-            <w:proofErr w:type="spellStart"/>
-            <w:r>
-              <w:rPr>
-                <w:sz w:val="20"/>
-                <w:szCs w:val="20"/>
-                <w:lang w:val="en-US"/>
-              </w:rPr>
-              <w:t>Plotly</w:t>
-            </w:r>
-            <w:proofErr w:type="spellEnd"/>
-            <w:r>
-              <w:rPr>
-                <w:sz w:val="20"/>
-                <w:szCs w:val="20"/>
-                <w:lang w:val="en-US"/>
-              </w:rPr>
-              <w:t>) + Area (Matplotlib)</w:t>
+              <w:t>Line, Bar, Donut, Scatter Map (Plotly) + Area (Matplotlib)</w:t>
             </w:r>
           </w:p>
         </w:tc>
       </w:tr>
       <w:tr>
-        <w:tblPrEx>
-          <w:tblCellMar>
-            <w:top w:w="0" w:type="dxa"/>
-            <w:bottom w:w="0" w:type="dxa"/>
-          </w:tblCellMar>
-        </w:tblPrEx>
         <w:tc>
           <w:tcPr>
             <w:tcW w:w="4535" w:type="dxa"/>
@@ -4841,12 +4582,6 @@
         </w:tc>
       </w:tr>
       <w:tr>
-        <w:tblPrEx>
-          <w:tblCellMar>
-            <w:top w:w="0" w:type="dxa"/>
-            <w:bottom w:w="0" w:type="dxa"/>
-          </w:tblCellMar>
-        </w:tblPrEx>
         <w:tc>
           <w:tcPr>
             <w:tcW w:w="4535" w:type="dxa"/>
@@ -4914,7 +4649,16 @@
           <w:sz w:val="18"/>
           <w:szCs w:val="18"/>
         </w:rPr>
-        <w:t>Fonte: Elaborado pelos autores (2026).</w:t>
+        <w:t xml:space="preserve">Fonte: Elaborado pelos </w:t>
+      </w:r>
+      <w:r>
+        <w:rPr>
+          <w:i/>
+          <w:iCs/>
+          <w:sz w:val="18"/>
+          <w:szCs w:val="18"/>
+        </w:rPr>
+        <w:t>autores (2026).</w:t>
       </w:r>
     </w:p>
     <w:p>
@@ -5038,12 +4782,6 @@
         <w:gridCol w:w="4536"/>
       </w:tblGrid>
       <w:tr>
-        <w:tblPrEx>
-          <w:tblCellMar>
-            <w:top w:w="0" w:type="dxa"/>
-            <w:bottom w:w="0" w:type="dxa"/>
-          </w:tblCellMar>
-        </w:tblPrEx>
         <w:tc>
           <w:tcPr>
             <w:tcW w:w="4535" w:type="dxa"/>
@@ -5112,12 +4850,6 @@
         </w:tc>
       </w:tr>
       <w:tr>
-        <w:tblPrEx>
-          <w:tblCellMar>
-            <w:top w:w="0" w:type="dxa"/>
-            <w:bottom w:w="0" w:type="dxa"/>
-          </w:tblCellMar>
-        </w:tblPrEx>
         <w:tc>
           <w:tcPr>
             <w:tcW w:w="4535" w:type="dxa"/>
@@ -5172,12 +4904,6 @@
         </w:tc>
       </w:tr>
       <w:tr>
-        <w:tblPrEx>
-          <w:tblCellMar>
-            <w:top w:w="0" w:type="dxa"/>
-            <w:bottom w:w="0" w:type="dxa"/>
-          </w:tblCellMar>
-        </w:tblPrEx>
         <w:tc>
           <w:tcPr>
             <w:tcW w:w="4535" w:type="dxa"/>
@@ -5232,12 +4958,6 @@
         </w:tc>
       </w:tr>
       <w:tr>
-        <w:tblPrEx>
-          <w:tblCellMar>
-            <w:top w:w="0" w:type="dxa"/>
-            <w:bottom w:w="0" w:type="dxa"/>
-          </w:tblCellMar>
-        </w:tblPrEx>
         <w:tc>
           <w:tcPr>
             <w:tcW w:w="4535" w:type="dxa"/>
@@ -5286,34 +5006,18 @@
                 <w:lang w:val="en-US"/>
               </w:rPr>
             </w:pPr>
-            <w:proofErr w:type="spellStart"/>
             <w:r>
               <w:rPr>
                 <w:sz w:val="20"/>
                 <w:szCs w:val="20"/>
                 <w:lang w:val="en-US"/>
               </w:rPr>
-              <w:t>HuggingFace</w:t>
-            </w:r>
-            <w:proofErr w:type="spellEnd"/>
-            <w:r>
-              <w:rPr>
-                <w:sz w:val="20"/>
-                <w:szCs w:val="20"/>
-                <w:lang w:val="en-US"/>
-              </w:rPr>
-              <w:t xml:space="preserve"> all-MiniLM-L6-v2</w:t>
+              <w:t>HuggingFace all-MiniLM-L6-v2</w:t>
             </w:r>
           </w:p>
         </w:tc>
       </w:tr>
       <w:tr>
-        <w:tblPrEx>
-          <w:tblCellMar>
-            <w:top w:w="0" w:type="dxa"/>
-            <w:bottom w:w="0" w:type="dxa"/>
-          </w:tblCellMar>
-        </w:tblPrEx>
         <w:tc>
           <w:tcPr>
             <w:tcW w:w="4535" w:type="dxa"/>
@@ -5368,12 +5072,6 @@
         </w:tc>
       </w:tr>
       <w:tr>
-        <w:tblPrEx>
-          <w:tblCellMar>
-            <w:top w:w="0" w:type="dxa"/>
-            <w:bottom w:w="0" w:type="dxa"/>
-          </w:tblCellMar>
-        </w:tblPrEx>
         <w:tc>
           <w:tcPr>
             <w:tcW w:w="4535" w:type="dxa"/>
@@ -5428,12 +5126,6 @@
         </w:tc>
       </w:tr>
       <w:tr>
-        <w:tblPrEx>
-          <w:tblCellMar>
-            <w:top w:w="0" w:type="dxa"/>
-            <w:bottom w:w="0" w:type="dxa"/>
-          </w:tblCellMar>
-        </w:tblPrEx>
         <w:tc>
           <w:tcPr>
             <w:tcW w:w="4535" w:type="dxa"/>
@@ -5519,27 +5211,14 @@
       <w:r>
         <w:t xml:space="preserve">Disponível em: </w:t>
       </w:r>
-      <w:r>
-        <w:fldChar w:fldCharType="begin"/>
-      </w:r>
-      <w:r>
-        <w:instrText>HYPERLINK "https://youtu.be/SA3ayAbbnLQ"</w:instrText>
-      </w:r>
-      <w:r>
-        <w:fldChar w:fldCharType="separate"/>
-      </w:r>
-      <w:r>
-        <w:rPr>
-          <w:rStyle w:val="Hyperlink"/>
-        </w:rPr>
-        <w:t>https://youtu.be/SA3ayAbbnLQ</w:t>
-      </w:r>
-      <w:r>
-        <w:rPr>
-          <w:rStyle w:val="Hyperlink"/>
-        </w:rPr>
-        <w:fldChar w:fldCharType="end"/>
-      </w:r>
+      <w:hyperlink r:id="rId8" w:history="1">
+        <w:r>
+          <w:rPr>
+            <w:rStyle w:val="Hyperlink"/>
+          </w:rPr>
+          <w:t>https://youtu.be/SA3ayAbbnLQ</w:t>
+        </w:r>
+      </w:hyperlink>
     </w:p>
     <w:p>
       <w:r>
@@ -5553,20 +5232,12 @@
           <w:lang w:val="en-US"/>
         </w:rPr>
       </w:pPr>
-      <w:proofErr w:type="gramStart"/>
       <w:r>
         <w:rPr>
           <w:lang w:val="en-US"/>
         </w:rPr>
         <w:lastRenderedPageBreak/>
-        <w:t>7  PHYSICAL</w:t>
-      </w:r>
-      <w:proofErr w:type="gramEnd"/>
-      <w:r>
-        <w:rPr>
-          <w:lang w:val="en-US"/>
-        </w:rPr>
-        <w:t xml:space="preserve"> COMPUTING, EMBEDDED AI, ROBOTICS &amp; COGNITIVE IoT</w:t>
+        <w:t>7  PHYSICAL COMPUTING, EMBEDDED AI, ROBOTICS &amp; COGNITIVE IoT</w:t>
       </w:r>
     </w:p>
     <w:p>
@@ -5677,12 +5348,6 @@
         <w:gridCol w:w="3024"/>
       </w:tblGrid>
       <w:tr>
-        <w:tblPrEx>
-          <w:tblCellMar>
-            <w:top w:w="0" w:type="dxa"/>
-            <w:bottom w:w="0" w:type="dxa"/>
-          </w:tblCellMar>
-        </w:tblPrEx>
         <w:tc>
           <w:tcPr>
             <w:tcW w:w="3023" w:type="dxa"/>
@@ -5784,12 +5449,6 @@
         </w:tc>
       </w:tr>
       <w:tr>
-        <w:tblPrEx>
-          <w:tblCellMar>
-            <w:top w:w="0" w:type="dxa"/>
-            <w:bottom w:w="0" w:type="dxa"/>
-          </w:tblCellMar>
-        </w:tblPrEx>
         <w:tc>
           <w:tcPr>
             <w:tcW w:w="3023" w:type="dxa"/>
@@ -5870,12 +5529,6 @@
         </w:tc>
       </w:tr>
       <w:tr>
-        <w:tblPrEx>
-          <w:tblCellMar>
-            <w:top w:w="0" w:type="dxa"/>
-            <w:bottom w:w="0" w:type="dxa"/>
-          </w:tblCellMar>
-        </w:tblPrEx>
         <w:tc>
           <w:tcPr>
             <w:tcW w:w="3023" w:type="dxa"/>
@@ -5956,12 +5609,6 @@
         </w:tc>
       </w:tr>
       <w:tr>
-        <w:tblPrEx>
-          <w:tblCellMar>
-            <w:top w:w="0" w:type="dxa"/>
-            <w:bottom w:w="0" w:type="dxa"/>
-          </w:tblCellMar>
-        </w:tblPrEx>
         <w:tc>
           <w:tcPr>
             <w:tcW w:w="3023" w:type="dxa"/>
@@ -6042,12 +5689,6 @@
         </w:tc>
       </w:tr>
       <w:tr>
-        <w:tblPrEx>
-          <w:tblCellMar>
-            <w:top w:w="0" w:type="dxa"/>
-            <w:bottom w:w="0" w:type="dxa"/>
-          </w:tblCellMar>
-        </w:tblPrEx>
         <w:tc>
           <w:tcPr>
             <w:tcW w:w="3023" w:type="dxa"/>
@@ -6122,7 +5763,14 @@
                 <w:sz w:val="20"/>
                 <w:szCs w:val="20"/>
               </w:rPr>
-              <w:t>Todos LEDs + buzzer alternado</w:t>
+              <w:t xml:space="preserve">Todos LEDs + buzzer </w:t>
+            </w:r>
+            <w:r>
+              <w:rPr>
+                <w:sz w:val="20"/>
+                <w:szCs w:val="20"/>
+              </w:rPr>
+              <w:t>alternado</w:t>
             </w:r>
           </w:p>
         </w:tc>
@@ -6194,7 +5842,13 @@
         <w:rPr>
           <w:color w:val="000000"/>
         </w:rPr>
-        <w:t>O projeto implementa um pipeline RAG (Retrieval-Augmented Generation) especializado em edifícios verdes e Net Zero de energia e água, construído integralmente em ambiente local sem dependência de APIs externas pagas. O corpus é formado por 15 documentos técnicos (normas, relatórios e manuais), divididos em 95 chunks com média de 129 tokens cada.</w:t>
+        <w:t xml:space="preserve">O projeto implementa um pipeline RAG (Retrieval-Augmented Generation) especializado em edifícios verdes e Net Zero de energia e água, construído integralmente em ambiente local sem dependência de APIs externas pagas. O corpus é </w:t>
+      </w:r>
+      <w:r>
+        <w:rPr>
+          <w:color w:val="000000"/>
+        </w:rPr>
+        <w:t>formado por 15 documentos técnicos (normas, relatórios e manuais), divididos em 95 chunks com média de 129 tokens cada.</w:t>
       </w:r>
     </w:p>
     <w:p>
@@ -6292,12 +5946,6 @@
         <w:gridCol w:w="3024"/>
       </w:tblGrid>
       <w:tr>
-        <w:tblPrEx>
-          <w:tblCellMar>
-            <w:top w:w="0" w:type="dxa"/>
-            <w:bottom w:w="0" w:type="dxa"/>
-          </w:tblCellMar>
-        </w:tblPrEx>
         <w:tc>
           <w:tcPr>
             <w:tcW w:w="3023" w:type="dxa"/>
@@ -6399,12 +6047,6 @@
         </w:tc>
       </w:tr>
       <w:tr>
-        <w:tblPrEx>
-          <w:tblCellMar>
-            <w:top w:w="0" w:type="dxa"/>
-            <w:bottom w:w="0" w:type="dxa"/>
-          </w:tblCellMar>
-        </w:tblPrEx>
         <w:tc>
           <w:tcPr>
             <w:tcW w:w="3023" w:type="dxa"/>
@@ -6485,12 +6127,6 @@
         </w:tc>
       </w:tr>
       <w:tr>
-        <w:tblPrEx>
-          <w:tblCellMar>
-            <w:top w:w="0" w:type="dxa"/>
-            <w:bottom w:w="0" w:type="dxa"/>
-          </w:tblCellMar>
-        </w:tblPrEx>
         <w:tc>
           <w:tcPr>
             <w:tcW w:w="3023" w:type="dxa"/>
@@ -6571,12 +6207,6 @@
         </w:tc>
       </w:tr>
       <w:tr>
-        <w:tblPrEx>
-          <w:tblCellMar>
-            <w:top w:w="0" w:type="dxa"/>
-            <w:bottom w:w="0" w:type="dxa"/>
-          </w:tblCellMar>
-        </w:tblPrEx>
         <w:tc>
           <w:tcPr>
             <w:tcW w:w="3023" w:type="dxa"/>
@@ -6657,12 +6287,6 @@
         </w:tc>
       </w:tr>
       <w:tr>
-        <w:tblPrEx>
-          <w:tblCellMar>
-            <w:top w:w="0" w:type="dxa"/>
-            <w:bottom w:w="0" w:type="dxa"/>
-          </w:tblCellMar>
-        </w:tblPrEx>
         <w:tc>
           <w:tcPr>
             <w:tcW w:w="3023" w:type="dxa"/>
@@ -6774,27 +6398,14 @@
         <w:lastRenderedPageBreak/>
         <w:t xml:space="preserve">Disponível em: </w:t>
       </w:r>
-      <w:r>
-        <w:fldChar w:fldCharType="begin"/>
-      </w:r>
-      <w:r>
-        <w:instrText>HYPERLINK "https://youtu.be/_eCXcS0mh9k"</w:instrText>
-      </w:r>
-      <w:r>
-        <w:fldChar w:fldCharType="separate"/>
-      </w:r>
-      <w:r>
-        <w:rPr>
-          <w:rStyle w:val="Hyperlink"/>
-        </w:rPr>
-        <w:t>https://youtu.be/_eCXcS0mh9k</w:t>
-      </w:r>
-      <w:r>
-        <w:rPr>
-          <w:rStyle w:val="Hyperlink"/>
-        </w:rPr>
-        <w:fldChar w:fldCharType="end"/>
-      </w:r>
+      <w:hyperlink r:id="rId9" w:history="1">
+        <w:r>
+          <w:rPr>
+            <w:rStyle w:val="Hyperlink"/>
+          </w:rPr>
+          <w:t>https://youtu.be/_eCXcS0mh9k</w:t>
+        </w:r>
+      </w:hyperlink>
     </w:p>
     <w:p>
       <w:r>
@@ -6827,7 +6438,13 @@
         <w:rPr>
           <w:color w:val="000000"/>
         </w:rPr>
-        <w:t>Incêndios florestais (wildfires) causam perdas ambientais e humanas de grande escala. A identificação precoce de focos de incêndio em imagens satelitais ou aéreas permite acionar equipes de combate antes que o fogo atinja proporções incontroláveis. Modelos de classificação de imagens baseados em Deep Learning são candidatos naturais para essa tarefa.</w:t>
+        <w:t xml:space="preserve">Incêndios florestais (wildfires) causam perdas ambientais e humanas de grande escala. A identificação precoce de focos de incêndio em imagens satelitais ou aéreas </w:t>
+      </w:r>
+      <w:r>
+        <w:rPr>
+          <w:color w:val="000000"/>
+        </w:rPr>
+        <w:t>permite acionar equipes de combate antes que o fogo atinja proporções incontroláveis. Modelos de classificação de imagens baseados em Deep Learning são candidatos naturais para essa tarefa.</w:t>
       </w:r>
     </w:p>
     <w:p>
@@ -6917,12 +6534,6 @@
         <w:gridCol w:w="4536"/>
       </w:tblGrid>
       <w:tr>
-        <w:tblPrEx>
-          <w:tblCellMar>
-            <w:top w:w="0" w:type="dxa"/>
-            <w:bottom w:w="0" w:type="dxa"/>
-          </w:tblCellMar>
-        </w:tblPrEx>
         <w:tc>
           <w:tcPr>
             <w:tcW w:w="4535" w:type="dxa"/>
@@ -6991,12 +6602,6 @@
         </w:tc>
       </w:tr>
       <w:tr>
-        <w:tblPrEx>
-          <w:tblCellMar>
-            <w:top w:w="0" w:type="dxa"/>
-            <w:bottom w:w="0" w:type="dxa"/>
-          </w:tblCellMar>
-        </w:tblPrEx>
         <w:tc>
           <w:tcPr>
             <w:tcW w:w="4535" w:type="dxa"/>
@@ -7051,12 +6656,6 @@
         </w:tc>
       </w:tr>
       <w:tr>
-        <w:tblPrEx>
-          <w:tblCellMar>
-            <w:top w:w="0" w:type="dxa"/>
-            <w:bottom w:w="0" w:type="dxa"/>
-          </w:tblCellMar>
-        </w:tblPrEx>
         <w:tc>
           <w:tcPr>
             <w:tcW w:w="4535" w:type="dxa"/>
@@ -7105,7 +6704,6 @@
                 <w:lang w:val="en-US"/>
               </w:rPr>
             </w:pPr>
-            <w:proofErr w:type="spellStart"/>
             <w:r>
               <w:rPr>
                 <w:sz w:val="20"/>
@@ -7114,7 +6712,6 @@
               </w:rPr>
               <w:t>Melhor</w:t>
             </w:r>
-            <w:proofErr w:type="spellEnd"/>
             <w:r>
               <w:rPr>
                 <w:sz w:val="20"/>
@@ -7127,12 +6724,6 @@
         </w:tc>
       </w:tr>
       <w:tr>
-        <w:tblPrEx>
-          <w:tblCellMar>
-            <w:top w:w="0" w:type="dxa"/>
-            <w:bottom w:w="0" w:type="dxa"/>
-          </w:tblCellMar>
-        </w:tblPrEx>
         <w:tc>
           <w:tcPr>
             <w:tcW w:w="4535" w:type="dxa"/>
@@ -7187,12 +6778,6 @@
         </w:tc>
       </w:tr>
       <w:tr>
-        <w:tblPrEx>
-          <w:tblCellMar>
-            <w:top w:w="0" w:type="dxa"/>
-            <w:bottom w:w="0" w:type="dxa"/>
-          </w:tblCellMar>
-        </w:tblPrEx>
         <w:tc>
           <w:tcPr>
             <w:tcW w:w="4535" w:type="dxa"/>
@@ -7247,12 +6832,6 @@
         </w:tc>
       </w:tr>
       <w:tr>
-        <w:tblPrEx>
-          <w:tblCellMar>
-            <w:top w:w="0" w:type="dxa"/>
-            <w:bottom w:w="0" w:type="dxa"/>
-          </w:tblCellMar>
-        </w:tblPrEx>
         <w:tc>
           <w:tcPr>
             <w:tcW w:w="4535" w:type="dxa"/>
@@ -7307,12 +6886,6 @@
         </w:tc>
       </w:tr>
       <w:tr>
-        <w:tblPrEx>
-          <w:tblCellMar>
-            <w:top w:w="0" w:type="dxa"/>
-            <w:bottom w:w="0" w:type="dxa"/>
-          </w:tblCellMar>
-        </w:tblPrEx>
         <w:tc>
           <w:tcPr>
             <w:tcW w:w="4535" w:type="dxa"/>
@@ -7413,7 +6986,13 @@
         <w:rPr>
           <w:color w:val="000000"/>
         </w:rPr>
-        <w:t>A disciplina de Governança em IA e Business Analytics ocupa um papel transversal nesta Global Solution: cabe a ela não apenas produzir um entregável próprio, mas também avaliar criticamente de que forma os demais projetos do grupo se integram entre si, e quais práticas de governança responsável de IA estão presentes ou ausentes em cada módulo.</w:t>
+        <w:t xml:space="preserve">A disciplina de Governança em IA e Business Analytics ocupa um papel transversal nesta Global Solution: cabe a ela não apenas produzir um entregável </w:t>
+      </w:r>
+      <w:r>
+        <w:rPr>
+          <w:color w:val="000000"/>
+        </w:rPr>
+        <w:t>próprio, mas também avaliar criticamente de que forma os demais projetos do grupo se integram entre si, e quais práticas de governança responsável de IA estão presentes ou ausentes em cada módulo.</w:t>
       </w:r>
     </w:p>
     <w:p>
@@ -7505,12 +7084,6 @@
         <w:gridCol w:w="2268"/>
       </w:tblGrid>
       <w:tr>
-        <w:tblPrEx>
-          <w:tblCellMar>
-            <w:top w:w="0" w:type="dxa"/>
-            <w:bottom w:w="0" w:type="dxa"/>
-          </w:tblCellMar>
-        </w:tblPrEx>
         <w:tc>
           <w:tcPr>
             <w:tcW w:w="2267" w:type="dxa"/>
@@ -7645,12 +7218,6 @@
         </w:tc>
       </w:tr>
       <w:tr>
-        <w:tblPrEx>
-          <w:tblCellMar>
-            <w:top w:w="0" w:type="dxa"/>
-            <w:bottom w:w="0" w:type="dxa"/>
-          </w:tblCellMar>
-        </w:tblPrEx>
         <w:tc>
           <w:tcPr>
             <w:tcW w:w="2267" w:type="dxa"/>
@@ -7757,12 +7324,6 @@
         </w:tc>
       </w:tr>
       <w:tr>
-        <w:tblPrEx>
-          <w:tblCellMar>
-            <w:top w:w="0" w:type="dxa"/>
-            <w:bottom w:w="0" w:type="dxa"/>
-          </w:tblCellMar>
-        </w:tblPrEx>
         <w:tc>
           <w:tcPr>
             <w:tcW w:w="2267" w:type="dxa"/>
@@ -7869,12 +7430,6 @@
         </w:tc>
       </w:tr>
       <w:tr>
-        <w:tblPrEx>
-          <w:tblCellMar>
-            <w:top w:w="0" w:type="dxa"/>
-            <w:bottom w:w="0" w:type="dxa"/>
-          </w:tblCellMar>
-        </w:tblPrEx>
         <w:tc>
           <w:tcPr>
             <w:tcW w:w="2267" w:type="dxa"/>
@@ -7975,18 +7530,19 @@
                 <w:sz w:val="20"/>
                 <w:szCs w:val="20"/>
               </w:rPr>
-              <w:t>Detecção de anomalias em telemetria LEO</w:t>
+              <w:t xml:space="preserve">Detecção de </w:t>
+            </w:r>
+            <w:r>
+              <w:rPr>
+                <w:sz w:val="20"/>
+                <w:szCs w:val="20"/>
+              </w:rPr>
+              <w:t>anomalias em telemetria LEO</w:t>
             </w:r>
           </w:p>
         </w:tc>
       </w:tr>
       <w:tr>
-        <w:tblPrEx>
-          <w:tblCellMar>
-            <w:top w:w="0" w:type="dxa"/>
-            <w:bottom w:w="0" w:type="dxa"/>
-          </w:tblCellMar>
-        </w:tblPrEx>
         <w:tc>
           <w:tcPr>
             <w:tcW w:w="2267" w:type="dxa"/>
@@ -8093,12 +7649,6 @@
         </w:tc>
       </w:tr>
       <w:tr>
-        <w:tblPrEx>
-          <w:tblCellMar>
-            <w:top w:w="0" w:type="dxa"/>
-            <w:bottom w:w="0" w:type="dxa"/>
-          </w:tblCellMar>
-        </w:tblPrEx>
         <w:tc>
           <w:tcPr>
             <w:tcW w:w="2267" w:type="dxa"/>
@@ -8205,12 +7755,6 @@
         </w:tc>
       </w:tr>
       <w:tr>
-        <w:tblPrEx>
-          <w:tblCellMar>
-            <w:top w:w="0" w:type="dxa"/>
-            <w:bottom w:w="0" w:type="dxa"/>
-          </w:tblCellMar>
-        </w:tblPrEx>
         <w:tc>
           <w:tcPr>
             <w:tcW w:w="2267" w:type="dxa"/>
@@ -8311,18 +7855,19 @@
                 <w:sz w:val="20"/>
                 <w:szCs w:val="20"/>
               </w:rPr>
-              <w:t>Monitoramento de plataforma de lançamento</w:t>
+              <w:t xml:space="preserve">Monitoramento de </w:t>
+            </w:r>
+            <w:r>
+              <w:rPr>
+                <w:sz w:val="20"/>
+                <w:szCs w:val="20"/>
+              </w:rPr>
+              <w:t>plataforma de lançamento</w:t>
             </w:r>
           </w:p>
         </w:tc>
       </w:tr>
       <w:tr>
-        <w:tblPrEx>
-          <w:tblCellMar>
-            <w:top w:w="0" w:type="dxa"/>
-            <w:bottom w:w="0" w:type="dxa"/>
-          </w:tblCellMar>
-        </w:tblPrEx>
         <w:tc>
           <w:tcPr>
             <w:tcW w:w="2267" w:type="dxa"/>
@@ -8430,12 +7975,6 @@
         </w:tc>
       </w:tr>
       <w:tr>
-        <w:tblPrEx>
-          <w:tblCellMar>
-            <w:top w:w="0" w:type="dxa"/>
-            <w:bottom w:w="0" w:type="dxa"/>
-          </w:tblCellMar>
-        </w:tblPrEx>
         <w:tc>
           <w:tcPr>
             <w:tcW w:w="2267" w:type="dxa"/>
@@ -8554,7 +8093,16 @@
           <w:sz w:val="18"/>
           <w:szCs w:val="18"/>
         </w:rPr>
-        <w:t>Fonte: Elaborado pelos autores (2026).</w:t>
+        <w:t xml:space="preserve">Fonte: Elaborado pelos </w:t>
+      </w:r>
+      <w:r>
+        <w:rPr>
+          <w:i/>
+          <w:iCs/>
+          <w:sz w:val="18"/>
+          <w:szCs w:val="18"/>
+        </w:rPr>
+        <w:t>autores (2026).</w:t>
       </w:r>
     </w:p>
     <w:p>
@@ -8724,7 +8272,13 @@
         <w:rPr>
           <w:color w:val="000000"/>
         </w:rPr>
-        <w:t>Todos os projetos desenvolvidos ao longo do semestre estão disponíveis no repositório público do GitHub do grupo:</w:t>
+        <w:t xml:space="preserve">Todos os </w:t>
+      </w:r>
+      <w:r>
+        <w:rPr>
+          <w:color w:val="000000"/>
+        </w:rPr>
+        <w:t>projetos desenvolvidos ao longo do semestre estão disponíveis no repositório público do GitHub do grupo:</w:t>
       </w:r>
     </w:p>
     <w:p>
@@ -8830,12 +8384,6 @@
         <w:gridCol w:w="4536"/>
       </w:tblGrid>
       <w:tr>
-        <w:tblPrEx>
-          <w:tblCellMar>
-            <w:top w:w="0" w:type="dxa"/>
-            <w:bottom w:w="0" w:type="dxa"/>
-          </w:tblCellMar>
-        </w:tblPrEx>
         <w:tc>
           <w:tcPr>
             <w:tcW w:w="4535" w:type="dxa"/>
@@ -8904,12 +8452,6 @@
         </w:tc>
       </w:tr>
       <w:tr>
-        <w:tblPrEx>
-          <w:tblCellMar>
-            <w:top w:w="0" w:type="dxa"/>
-            <w:bottom w:w="0" w:type="dxa"/>
-          </w:tblCellMar>
-        </w:tblPrEx>
         <w:tc>
           <w:tcPr>
             <w:tcW w:w="4535" w:type="dxa"/>
@@ -8964,12 +8506,6 @@
         </w:tc>
       </w:tr>
       <w:tr>
-        <w:tblPrEx>
-          <w:tblCellMar>
-            <w:top w:w="0" w:type="dxa"/>
-            <w:bottom w:w="0" w:type="dxa"/>
-          </w:tblCellMar>
-        </w:tblPrEx>
         <w:tc>
           <w:tcPr>
             <w:tcW w:w="4535" w:type="dxa"/>
@@ -9024,12 +8560,6 @@
         </w:tc>
       </w:tr>
       <w:tr>
-        <w:tblPrEx>
-          <w:tblCellMar>
-            <w:top w:w="0" w:type="dxa"/>
-            <w:bottom w:w="0" w:type="dxa"/>
-          </w:tblCellMar>
-        </w:tblPrEx>
         <w:tc>
           <w:tcPr>
             <w:tcW w:w="4535" w:type="dxa"/>
@@ -9084,12 +8614,6 @@
         </w:tc>
       </w:tr>
       <w:tr>
-        <w:tblPrEx>
-          <w:tblCellMar>
-            <w:top w:w="0" w:type="dxa"/>
-            <w:bottom w:w="0" w:type="dxa"/>
-          </w:tblCellMar>
-        </w:tblPrEx>
         <w:tc>
           <w:tcPr>
             <w:tcW w:w="4535" w:type="dxa"/>
@@ -9144,12 +8668,6 @@
         </w:tc>
       </w:tr>
       <w:tr>
-        <w:tblPrEx>
-          <w:tblCellMar>
-            <w:top w:w="0" w:type="dxa"/>
-            <w:bottom w:w="0" w:type="dxa"/>
-          </w:tblCellMar>
-        </w:tblPrEx>
         <w:tc>
           <w:tcPr>
             <w:tcW w:w="4535" w:type="dxa"/>
@@ -9204,12 +8722,6 @@
         </w:tc>
       </w:tr>
       <w:tr>
-        <w:tblPrEx>
-          <w:tblCellMar>
-            <w:top w:w="0" w:type="dxa"/>
-            <w:bottom w:w="0" w:type="dxa"/>
-          </w:tblCellMar>
-        </w:tblPrEx>
         <w:tc>
           <w:tcPr>
             <w:tcW w:w="4535" w:type="dxa"/>
@@ -9232,7 +8744,14 @@
                 <w:sz w:val="20"/>
                 <w:szCs w:val="20"/>
               </w:rPr>
-              <w:t>Front End &amp; Mobile Development</w:t>
+              <w:t xml:space="preserve">Front End &amp; Mobile </w:t>
+            </w:r>
+            <w:r>
+              <w:rPr>
+                <w:sz w:val="20"/>
+                <w:szCs w:val="20"/>
+              </w:rPr>
+              <w:t>Development</w:t>
             </w:r>
           </w:p>
         </w:tc>
@@ -9264,12 +8783,6 @@
         </w:tc>
       </w:tr>
       <w:tr>
-        <w:tblPrEx>
-          <w:tblCellMar>
-            <w:top w:w="0" w:type="dxa"/>
-            <w:bottom w:w="0" w:type="dxa"/>
-          </w:tblCellMar>
-        </w:tblPrEx>
         <w:tc>
           <w:tcPr>
             <w:tcW w:w="4535" w:type="dxa"/>
@@ -9324,12 +8837,6 @@
         </w:tc>
       </w:tr>
       <w:tr>
-        <w:tblPrEx>
-          <w:tblCellMar>
-            <w:top w:w="0" w:type="dxa"/>
-            <w:bottom w:w="0" w:type="dxa"/>
-          </w:tblCellMar>
-        </w:tblPrEx>
         <w:tc>
           <w:tcPr>
             <w:tcW w:w="4535" w:type="dxa"/>
@@ -9446,7 +8953,13 @@
         <w:rPr>
           <w:color w:val="000000"/>
         </w:rPr>
-        <w:t>Os oito projetos entregues cobrem um espectro amplo da cadeia de valor de sistemas inteligentes: da coleta de dados físicos (IoT com ESP32), passando pelo processamento em camadas (pipeline Medallion no Cluster Computing), classificação visual (Visão Computacional com EfficientNet), compreensão de linguagem natural (NLP com RAG e Qwen2.5:3b), consulta inteligente a documentos (SpaceRAG com Llama 3.1), exploração de paradigmas emergentes de computação (QML com Qiskit), automação de relatórios (RPA com NLTK e OpenCV) e visualização interativa (PyroWatch com Streamlit e Plotly).</w:t>
+        <w:t>Os oito projetos entregues cobrem um espectro amplo da cadeia de valor de sistemas inteligentes: da coleta de dados físicos (IoT com ESP32), passando pelo processamento em camadas (pipeline Medallion no Cluster Computing), classificação visual (Visão Computacional com EfficientNet), compreensão de linguagem natural (NLP com RAG e Qwen2.5:3b), consulta inteligente a documentos (SpaceRAG com Llama 3.1), exploração de paradigmas emergentes de computação (QML com Qiskit), automação de relatórios (RPA com NLTK e</w:t>
+      </w:r>
+      <w:r>
+        <w:rPr>
+          <w:color w:val="000000"/>
+        </w:rPr>
+        <w:t xml:space="preserve"> OpenCV) e visualização interativa (PyroWatch com Streamlit e Plotly).</w:t>
       </w:r>
     </w:p>
     <w:p>
@@ -9458,7 +8971,13 @@
         <w:rPr>
           <w:color w:val="000000"/>
         </w:rPr>
-        <w:t>Do ponto de vista da Governança em IA, o grupo demonstrou, em diferentes graus, práticas como rastreabilidade de dados (linhagem Medallion), explicabilidade (SHAP, citação de fontes em sistemas RAG), controle de viés (datasets balanceados, curvas ROC), privacidade por design (LLMs locais via Ollama) e segurança (dados de sensores sem PII no sistema IoT). Essas práticas, ainda que aplicadas de forma isolada em cada projeto, formam o núcleo de uma cultura de desenvolvimento responsável de IA que o grupo pretende aprofundar nos próximos semestres.</w:t>
+        <w:t>Do ponto de vista da Governança em IA, o grupo demonstrou, em diferentes graus, práticas como rastreabilidade de dados (linhagem Medallion), explicabilidade (SHAP, citação de fontes em sistemas RAG), controle de viés (datasets balanceados, curvas ROC), privacidade por design (LLMs locais via Ollama) e segurança (dados de sensores sem PII no sistema IoT). Essas práticas, ainda que aplicadas de forma isolada em cada projeto, formam o núcleo de uma cultura de desenvolvimento responsável de IA que o grupo prete</w:t>
+      </w:r>
+      <w:r>
+        <w:rPr>
+          <w:color w:val="000000"/>
+        </w:rPr>
+        <w:t>nde aprofundar nos próximos semestres.</w:t>
       </w:r>
     </w:p>
     <w:p>
@@ -9531,23 +9050,7 @@
           <w:color w:val="000000"/>
           <w:lang w:val="en-US"/>
         </w:rPr>
-        <w:t xml:space="preserve">DAVIES, M. et al. </w:t>
-      </w:r>
-      <w:proofErr w:type="spellStart"/>
-      <w:r>
-        <w:rPr>
-          <w:color w:val="000000"/>
-          <w:lang w:val="en-US"/>
-        </w:rPr>
-        <w:t>Loihi</w:t>
-      </w:r>
-      <w:proofErr w:type="spellEnd"/>
-      <w:r>
-        <w:rPr>
-          <w:color w:val="000000"/>
-          <w:lang w:val="en-US"/>
-        </w:rPr>
-        <w:t xml:space="preserve">: A Neuromorphic Manycore Processor with On-Chip Learning. </w:t>
+        <w:t xml:space="preserve">DAVIES, M. et al. Loihi: A Neuromorphic Manycore Processor with On-Chip Learning. </w:t>
       </w:r>
       <w:r>
         <w:rPr>
@@ -9715,87 +9218,14 @@
           <w:color w:val="000000"/>
           <w:lang w:val="en-US"/>
         </w:rPr>
-        <w:t xml:space="preserve">QISKIT COMMUNITY. </w:t>
-      </w:r>
-      <w:proofErr w:type="spellStart"/>
+        <w:t>QISKIT COMMUNITY. Qiskit Machine Learning Documentation. Disponível em</w:t>
+      </w:r>
       <w:r>
         <w:rPr>
           <w:color w:val="000000"/>
           <w:lang w:val="en-US"/>
         </w:rPr>
-        <w:t>Qiskit</w:t>
-      </w:r>
-      <w:proofErr w:type="spellEnd"/>
-      <w:r>
-        <w:rPr>
-          <w:color w:val="000000"/>
-          <w:lang w:val="en-US"/>
-        </w:rPr>
-        <w:t xml:space="preserve"> Machine Learning Documentation. </w:t>
-      </w:r>
-      <w:proofErr w:type="spellStart"/>
-      <w:r>
-        <w:rPr>
-          <w:color w:val="000000"/>
-          <w:lang w:val="en-US"/>
-        </w:rPr>
-        <w:t>Disponível</w:t>
-      </w:r>
-      <w:proofErr w:type="spellEnd"/>
-      <w:r>
-        <w:rPr>
-          <w:color w:val="000000"/>
-          <w:lang w:val="en-US"/>
-        </w:rPr>
-        <w:t xml:space="preserve"> </w:t>
-      </w:r>
-      <w:proofErr w:type="spellStart"/>
-      <w:r>
-        <w:rPr>
-          <w:color w:val="000000"/>
-          <w:lang w:val="en-US"/>
-        </w:rPr>
-        <w:t>em</w:t>
-      </w:r>
-      <w:proofErr w:type="spellEnd"/>
-      <w:r>
-        <w:rPr>
-          <w:color w:val="000000"/>
-          <w:lang w:val="en-US"/>
-        </w:rPr>
-        <w:t xml:space="preserve">: https://qiskit-community.github.io/qiskit-machine-learning. </w:t>
-      </w:r>
-      <w:proofErr w:type="spellStart"/>
-      <w:r>
-        <w:rPr>
-          <w:color w:val="000000"/>
-          <w:lang w:val="en-US"/>
-        </w:rPr>
-        <w:t>Acesso</w:t>
-      </w:r>
-      <w:proofErr w:type="spellEnd"/>
-      <w:r>
-        <w:rPr>
-          <w:color w:val="000000"/>
-          <w:lang w:val="en-US"/>
-        </w:rPr>
-        <w:t xml:space="preserve"> </w:t>
-      </w:r>
-      <w:proofErr w:type="spellStart"/>
-      <w:r>
-        <w:rPr>
-          <w:color w:val="000000"/>
-          <w:lang w:val="en-US"/>
-        </w:rPr>
-        <w:t>em</w:t>
-      </w:r>
-      <w:proofErr w:type="spellEnd"/>
-      <w:r>
-        <w:rPr>
-          <w:color w:val="000000"/>
-          <w:lang w:val="en-US"/>
-        </w:rPr>
-        <w:t>: jun. 2026.</w:t>
+        <w:t>: https://qiskit-community.github.io/qiskit-machine-learning. Acesso em: jun. 2026.</w:t>
       </w:r>
     </w:p>
     <w:p>
@@ -9818,7 +9248,7 @@
       </w:r>
     </w:p>
     <w:sectPr>
-      <w:footerReference w:type="default" r:id="rId7"/>
+      <w:footerReference w:type="default" r:id="rId10"/>
       <w:pgSz w:w="11906" w:h="16838"/>
       <w:pgMar w:top="1701" w:right="1134" w:bottom="1134" w:left="1701" w:header="708" w:footer="708" w:gutter="0"/>
       <w:cols w:space="720"/>

</xml_diff>